<commit_message>
Reformat June Word articles with VK and TG sections
Co-authored-by: maryasg <maryasg@users.noreply.github.com>
</commit_message>
<xml_diff>
--- a/tools/ksp-image-prompts/ручные_статьи_июнь/статья01_июнь_2026_kak-ostanovit-krovotochivost-desen.docx
+++ b/tools/ksp-image-prompts/ручные_статьи_июнь/статья01_июнь_2026_kak-ostanovit-krovotochivost-desen.docx
@@ -4,7 +4,21 @@
   <w:body>
     <w:p>
       <w:pPr>
-        <w:spacing w:after="240" w:before="0"/>
+        <w:spacing w:before="0" w:after="160" w:line="269" w:lineRule="auto"/>
+      </w:pPr>
+      <w:r>
+        <w:rPr>
+          <w:rFonts w:ascii="Arial" w:hAnsi="Arial"/>
+          <w:b/>
+          <w:color w:val="C00000"/>
+          <w:sz w:val="30"/>
+        </w:rPr>
+        <w:t>для Вконтакте:</w:t>
+      </w:r>
+    </w:p>
+    <w:p>
+      <w:pPr>
+        <w:spacing w:before="0" w:after="240" w:line="269" w:lineRule="auto"/>
       </w:pPr>
       <w:r>
         <w:rPr>
@@ -17,33 +31,7 @@
     </w:p>
     <w:p>
       <w:pPr>
-        <w:spacing w:after="160" w:before="0"/>
-      </w:pPr>
-      <w:r>
-        <w:rPr>
-          <w:rFonts w:ascii="Arial" w:hAnsi="Arial"/>
-          <w:b w:val="0"/>
-          <w:sz w:val="24"/>
-        </w:rPr>
-        <w:t>——————</w:t>
-      </w:r>
-    </w:p>
-    <w:p>
-      <w:pPr>
-        <w:spacing w:after="200" w:before="0"/>
-      </w:pPr>
-      <w:r>
-        <w:rPr>
-          <w:rFonts w:ascii="Arial" w:hAnsi="Arial"/>
-          <w:b/>
-          <w:sz w:val="28"/>
-        </w:rPr>
-        <w:t>Версия для ВКонтакте (ВК)</w:t>
-      </w:r>
-    </w:p>
-    <w:p>
-      <w:pPr>
-        <w:spacing w:after="80" w:before="0"/>
+        <w:spacing w:before="0" w:after="120" w:line="269" w:lineRule="auto"/>
       </w:pPr>
       <w:r>
         <w:rPr>
@@ -56,33 +44,41 @@
     </w:p>
     <w:p>
       <w:pPr>
-        <w:spacing w:after="80" w:before="0"/>
+        <w:spacing w:before="80" w:after="100" w:line="269" w:lineRule="auto"/>
       </w:pPr>
+      <w:r>
+        <w:rPr>
+          <w:rFonts w:ascii="Arial" w:hAnsi="Arial"/>
+          <w:b/>
+          <w:color w:val="1F4E79"/>
+          <w:sz w:val="26"/>
+        </w:rPr>
+        <w:t>📌 Почему дёсны кровоточат</w:t>
+      </w:r>
+    </w:p>
+    <w:p>
+      <w:pPr>
+        <w:spacing w:after="120" w:line="269" w:lineRule="auto"/>
+      </w:pPr>
+      <w:r>
+        <w:rPr>
+          <w:rFonts w:ascii="Arial" w:hAnsi="Arial"/>
+          <w:b/>
+          <w:sz w:val="24"/>
+        </w:rPr>
+        <w:t>Частые причины:</w:t>
+      </w:r>
       <w:r>
         <w:rPr>
           <w:rFonts w:ascii="Arial" w:hAnsi="Arial"/>
           <w:b w:val="0"/>
           <w:sz w:val="24"/>
         </w:rPr>
-        <w:t>📌 Почему дёсны кровоточат</w:t>
       </w:r>
     </w:p>
     <w:p>
       <w:pPr>
-        <w:spacing w:after="80" w:before="0"/>
-      </w:pPr>
-      <w:r>
-        <w:rPr>
-          <w:rFonts w:ascii="Arial" w:hAnsi="Arial"/>
-          <w:b w:val="0"/>
-          <w:sz w:val="24"/>
-        </w:rPr>
-        <w:t>Частые причины:</w:t>
-      </w:r>
-    </w:p>
-    <w:p>
-      <w:pPr>
-        <w:spacing w:after="80" w:before="0"/>
+        <w:spacing w:before="0" w:after="60" w:line="269" w:lineRule="auto"/>
       </w:pPr>
       <w:r>
         <w:rPr>
@@ -95,7 +91,7 @@
     </w:p>
     <w:p>
       <w:pPr>
-        <w:spacing w:after="80" w:before="0"/>
+        <w:spacing w:before="0" w:after="60" w:line="269" w:lineRule="auto"/>
       </w:pPr>
       <w:r>
         <w:rPr>
@@ -108,7 +104,7 @@
     </w:p>
     <w:p>
       <w:pPr>
-        <w:spacing w:after="80" w:before="0"/>
+        <w:spacing w:before="0" w:after="60" w:line="269" w:lineRule="auto"/>
       </w:pPr>
       <w:r>
         <w:rPr>
@@ -121,7 +117,7 @@
     </w:p>
     <w:p>
       <w:pPr>
-        <w:spacing w:after="80" w:before="0"/>
+        <w:spacing w:before="0" w:after="60" w:line="269" w:lineRule="auto"/>
       </w:pPr>
       <w:r>
         <w:rPr>
@@ -134,7 +130,7 @@
     </w:p>
     <w:p>
       <w:pPr>
-        <w:spacing w:after="80" w:before="0"/>
+        <w:spacing w:before="0" w:after="60" w:line="269" w:lineRule="auto"/>
       </w:pPr>
       <w:r>
         <w:rPr>
@@ -147,7 +143,7 @@
     </w:p>
     <w:p>
       <w:pPr>
-        <w:spacing w:after="80" w:before="0"/>
+        <w:spacing w:before="0" w:after="60" w:line="269" w:lineRule="auto"/>
       </w:pPr>
       <w:r>
         <w:rPr>
@@ -160,7 +156,7 @@
     </w:p>
     <w:p>
       <w:pPr>
-        <w:spacing w:after="80" w:before="0"/>
+        <w:spacing w:before="0" w:after="120" w:line="269" w:lineRule="auto"/>
       </w:pPr>
       <w:r>
         <w:rPr>
@@ -173,33 +169,42 @@
     </w:p>
     <w:p>
       <w:pPr>
-        <w:spacing w:after="80" w:before="0"/>
+        <w:spacing w:before="80" w:after="100" w:line="269" w:lineRule="auto"/>
       </w:pPr>
+      <w:r>
+        <w:rPr>
+          <w:rFonts w:ascii="Arial" w:hAnsi="Arial"/>
+          <w:b/>
+          <w:color w:val="1F4E79"/>
+          <w:sz w:val="26"/>
+        </w:rPr>
+        <w:t>✅ Что можно сделать уже сегодня</w:t>
+      </w:r>
+    </w:p>
+    <w:p>
+      <w:pPr>
+        <w:spacing w:after="80" w:line="269" w:lineRule="auto"/>
+      </w:pPr>
+      <w:r>
+        <w:rPr>
+          <w:rFonts w:ascii="Arial" w:hAnsi="Arial"/>
+          <w:b/>
+          <w:sz w:val="24"/>
+        </w:rPr>
+        <w:t xml:space="preserve">1. </w:t>
+      </w:r>
       <w:r>
         <w:rPr>
           <w:rFonts w:ascii="Arial" w:hAnsi="Arial"/>
           <w:b w:val="0"/>
           <w:sz w:val="24"/>
         </w:rPr>
-        <w:t>✅ Что можно сделать уже сегодня</w:t>
+        <w:t>Смените технику чистки.</w:t>
       </w:r>
     </w:p>
     <w:p>
       <w:pPr>
-        <w:spacing w:after="80" w:before="0"/>
-      </w:pPr>
-      <w:r>
-        <w:rPr>
-          <w:rFonts w:ascii="Arial" w:hAnsi="Arial"/>
-          <w:b w:val="0"/>
-          <w:sz w:val="24"/>
-        </w:rPr>
-        <w:t>1. Смените технику чистки.</w:t>
-      </w:r>
-    </w:p>
-    <w:p>
-      <w:pPr>
-        <w:spacing w:after="80" w:before="0"/>
+        <w:spacing w:before="0" w:after="120" w:line="269" w:lineRule="auto"/>
       </w:pPr>
       <w:r>
         <w:rPr>
@@ -212,20 +217,28 @@
     </w:p>
     <w:p>
       <w:pPr>
-        <w:spacing w:after="80" w:before="0"/>
+        <w:spacing w:after="80" w:line="269" w:lineRule="auto"/>
       </w:pPr>
+      <w:r>
+        <w:rPr>
+          <w:rFonts w:ascii="Arial" w:hAnsi="Arial"/>
+          <w:b/>
+          <w:sz w:val="24"/>
+        </w:rPr>
+        <w:t xml:space="preserve">2. </w:t>
+      </w:r>
       <w:r>
         <w:rPr>
           <w:rFonts w:ascii="Arial" w:hAnsi="Arial"/>
           <w:b w:val="0"/>
           <w:sz w:val="24"/>
         </w:rPr>
-        <w:t>2. Выберите мягкую или среднюю щётку.</w:t>
+        <w:t>Выберите мягкую или среднюю щётку.</w:t>
       </w:r>
     </w:p>
     <w:p>
       <w:pPr>
-        <w:spacing w:after="80" w:before="0"/>
+        <w:spacing w:before="0" w:after="120" w:line="269" w:lineRule="auto"/>
       </w:pPr>
       <w:r>
         <w:rPr>
@@ -238,20 +251,28 @@
     </w:p>
     <w:p>
       <w:pPr>
-        <w:spacing w:after="80" w:before="0"/>
+        <w:spacing w:after="80" w:line="269" w:lineRule="auto"/>
       </w:pPr>
+      <w:r>
+        <w:rPr>
+          <w:rFonts w:ascii="Arial" w:hAnsi="Arial"/>
+          <w:b/>
+          <w:sz w:val="24"/>
+        </w:rPr>
+        <w:t xml:space="preserve">3. </w:t>
+      </w:r>
       <w:r>
         <w:rPr>
           <w:rFonts w:ascii="Arial" w:hAnsi="Arial"/>
           <w:b w:val="0"/>
           <w:sz w:val="24"/>
         </w:rPr>
-        <w:t>3. Подключите межзубную гигиену.</w:t>
+        <w:t>Подключите межзубную гигиену.</w:t>
       </w:r>
     </w:p>
     <w:p>
       <w:pPr>
-        <w:spacing w:after="80" w:before="0"/>
+        <w:spacing w:before="0" w:after="120" w:line="269" w:lineRule="auto"/>
       </w:pPr>
       <w:r>
         <w:rPr>
@@ -264,20 +285,28 @@
     </w:p>
     <w:p>
       <w:pPr>
-        <w:spacing w:after="80" w:before="0"/>
+        <w:spacing w:after="80" w:line="269" w:lineRule="auto"/>
       </w:pPr>
+      <w:r>
+        <w:rPr>
+          <w:rFonts w:ascii="Arial" w:hAnsi="Arial"/>
+          <w:b/>
+          <w:sz w:val="24"/>
+        </w:rPr>
+        <w:t xml:space="preserve">4. </w:t>
+      </w:r>
       <w:r>
         <w:rPr>
           <w:rFonts w:ascii="Arial" w:hAnsi="Arial"/>
           <w:b w:val="0"/>
           <w:sz w:val="24"/>
         </w:rPr>
-        <w:t>4. Полоскание — поддержка, не замена чистки.</w:t>
+        <w:t>Полоскание — поддержка, не замена чистки.</w:t>
       </w:r>
     </w:p>
     <w:p>
       <w:pPr>
-        <w:spacing w:after="80" w:before="0"/>
+        <w:spacing w:before="0" w:after="120" w:line="269" w:lineRule="auto"/>
       </w:pPr>
       <w:r>
         <w:rPr>
@@ -290,20 +319,28 @@
     </w:p>
     <w:p>
       <w:pPr>
-        <w:spacing w:after="80" w:before="0"/>
+        <w:spacing w:after="80" w:line="269" w:lineRule="auto"/>
       </w:pPr>
+      <w:r>
+        <w:rPr>
+          <w:rFonts w:ascii="Arial" w:hAnsi="Arial"/>
+          <w:b/>
+          <w:sz w:val="24"/>
+        </w:rPr>
+        <w:t xml:space="preserve">5. </w:t>
+      </w:r>
       <w:r>
         <w:rPr>
           <w:rFonts w:ascii="Arial" w:hAnsi="Arial"/>
           <w:b w:val="0"/>
           <w:sz w:val="24"/>
         </w:rPr>
-        <w:t>5. Следите за рационом и водой.</w:t>
+        <w:t>Следите за рационом и водой.</w:t>
       </w:r>
     </w:p>
     <w:p>
       <w:pPr>
-        <w:spacing w:after="80" w:before="0"/>
+        <w:spacing w:before="0" w:after="120" w:line="269" w:lineRule="auto"/>
       </w:pPr>
       <w:r>
         <w:rPr>
@@ -316,20 +353,28 @@
     </w:p>
     <w:p>
       <w:pPr>
-        <w:spacing w:after="80" w:before="0"/>
+        <w:spacing w:after="80" w:line="269" w:lineRule="auto"/>
       </w:pPr>
+      <w:r>
+        <w:rPr>
+          <w:rFonts w:ascii="Arial" w:hAnsi="Arial"/>
+          <w:b/>
+          <w:sz w:val="24"/>
+        </w:rPr>
+        <w:t xml:space="preserve">6. </w:t>
+      </w:r>
       <w:r>
         <w:rPr>
           <w:rFonts w:ascii="Arial" w:hAnsi="Arial"/>
           <w:b w:val="0"/>
           <w:sz w:val="24"/>
         </w:rPr>
-        <w:t>6. Не бросайте гигиену из страха крови.</w:t>
+        <w:t>Не бросайте гигиену из страха крови.</w:t>
       </w:r>
     </w:p>
     <w:p>
       <w:pPr>
-        <w:spacing w:after="80" w:before="0"/>
+        <w:spacing w:before="0" w:after="120" w:line="269" w:lineRule="auto"/>
       </w:pPr>
       <w:r>
         <w:rPr>
@@ -342,33 +387,41 @@
     </w:p>
     <w:p>
       <w:pPr>
-        <w:spacing w:after="80" w:before="0"/>
+        <w:spacing w:before="80" w:after="100" w:line="269" w:lineRule="auto"/>
       </w:pPr>
+      <w:r>
+        <w:rPr>
+          <w:rFonts w:ascii="Arial" w:hAnsi="Arial"/>
+          <w:b/>
+          <w:color w:val="1F4E79"/>
+          <w:sz w:val="26"/>
+        </w:rPr>
+        <w:t>⚠️ Когда обязательно к врачу</w:t>
+      </w:r>
+    </w:p>
+    <w:p>
+      <w:pPr>
+        <w:spacing w:after="120" w:line="269" w:lineRule="auto"/>
+      </w:pPr>
+      <w:r>
+        <w:rPr>
+          <w:rFonts w:ascii="Arial" w:hAnsi="Arial"/>
+          <w:b/>
+          <w:sz w:val="24"/>
+        </w:rPr>
+        <w:t>Обратитесь в клинику, если:</w:t>
+      </w:r>
       <w:r>
         <w:rPr>
           <w:rFonts w:ascii="Arial" w:hAnsi="Arial"/>
           <w:b w:val="0"/>
           <w:sz w:val="24"/>
         </w:rPr>
-        <w:t>⚠️ Когда обязательно к врачу</w:t>
       </w:r>
     </w:p>
     <w:p>
       <w:pPr>
-        <w:spacing w:after="80" w:before="0"/>
-      </w:pPr>
-      <w:r>
-        <w:rPr>
-          <w:rFonts w:ascii="Arial" w:hAnsi="Arial"/>
-          <w:b w:val="0"/>
-          <w:sz w:val="24"/>
-        </w:rPr>
-        <w:t>Обратитесь в клинику, если:</w:t>
-      </w:r>
-    </w:p>
-    <w:p>
-      <w:pPr>
-        <w:spacing w:after="80" w:before="0"/>
+        <w:spacing w:before="0" w:after="60" w:line="269" w:lineRule="auto"/>
       </w:pPr>
       <w:r>
         <w:rPr>
@@ -381,7 +434,7 @@
     </w:p>
     <w:p>
       <w:pPr>
-        <w:spacing w:after="80" w:before="0"/>
+        <w:spacing w:before="0" w:after="60" w:line="269" w:lineRule="auto"/>
       </w:pPr>
       <w:r>
         <w:rPr>
@@ -394,7 +447,7 @@
     </w:p>
     <w:p>
       <w:pPr>
-        <w:spacing w:after="80" w:before="0"/>
+        <w:spacing w:before="0" w:after="60" w:line="269" w:lineRule="auto"/>
       </w:pPr>
       <w:r>
         <w:rPr>
@@ -407,7 +460,7 @@
     </w:p>
     <w:p>
       <w:pPr>
-        <w:spacing w:after="80" w:before="0"/>
+        <w:spacing w:before="0" w:after="60" w:line="269" w:lineRule="auto"/>
       </w:pPr>
       <w:r>
         <w:rPr>
@@ -420,7 +473,7 @@
     </w:p>
     <w:p>
       <w:pPr>
-        <w:spacing w:after="80" w:before="0"/>
+        <w:spacing w:before="0" w:after="60" w:line="269" w:lineRule="auto"/>
       </w:pPr>
       <w:r>
         <w:rPr>
@@ -433,7 +486,7 @@
     </w:p>
     <w:p>
       <w:pPr>
-        <w:spacing w:after="80" w:before="0"/>
+        <w:spacing w:before="0" w:after="120" w:line="269" w:lineRule="auto"/>
       </w:pPr>
       <w:r>
         <w:rPr>
@@ -446,20 +499,21 @@
     </w:p>
     <w:p>
       <w:pPr>
-        <w:spacing w:after="80" w:before="0"/>
+        <w:spacing w:before="80" w:after="100" w:line="269" w:lineRule="auto"/>
       </w:pPr>
       <w:r>
         <w:rPr>
           <w:rFonts w:ascii="Arial" w:hAnsi="Arial"/>
-          <w:b w:val="0"/>
-          <w:sz w:val="24"/>
+          <w:b/>
+          <w:color w:val="1F4E79"/>
+          <w:sz w:val="26"/>
         </w:rPr>
         <w:t>🚫 Чего лучше не делать</w:t>
       </w:r>
     </w:p>
     <w:p>
       <w:pPr>
-        <w:spacing w:after="80" w:before="0"/>
+        <w:spacing w:before="0" w:after="60" w:line="269" w:lineRule="auto"/>
       </w:pPr>
       <w:r>
         <w:rPr>
@@ -472,7 +526,7 @@
     </w:p>
     <w:p>
       <w:pPr>
-        <w:spacing w:after="80" w:before="0"/>
+        <w:spacing w:before="0" w:after="60" w:line="269" w:lineRule="auto"/>
       </w:pPr>
       <w:r>
         <w:rPr>
@@ -485,7 +539,7 @@
     </w:p>
     <w:p>
       <w:pPr>
-        <w:spacing w:after="80" w:before="0"/>
+        <w:spacing w:before="0" w:after="60" w:line="269" w:lineRule="auto"/>
       </w:pPr>
       <w:r>
         <w:rPr>
@@ -498,7 +552,7 @@
     </w:p>
     <w:p>
       <w:pPr>
-        <w:spacing w:after="80" w:before="0"/>
+        <w:spacing w:before="0" w:after="60" w:line="269" w:lineRule="auto"/>
       </w:pPr>
       <w:r>
         <w:rPr>
@@ -511,20 +565,21 @@
     </w:p>
     <w:p>
       <w:pPr>
-        <w:spacing w:after="80" w:before="0"/>
+        <w:spacing w:before="80" w:after="100" w:line="269" w:lineRule="auto"/>
       </w:pPr>
       <w:r>
         <w:rPr>
           <w:rFonts w:ascii="Arial" w:hAnsi="Arial"/>
-          <w:b w:val="0"/>
-          <w:sz w:val="24"/>
+          <w:b/>
+          <w:color w:val="1F4E79"/>
+          <w:sz w:val="26"/>
         </w:rPr>
         <w:t>💡 Важно</w:t>
       </w:r>
     </w:p>
     <w:p>
       <w:pPr>
-        <w:spacing w:after="80" w:before="0"/>
+        <w:spacing w:before="0" w:after="120" w:line="269" w:lineRule="auto"/>
       </w:pPr>
       <w:r>
         <w:rPr>
@@ -537,7 +592,198 @@
     </w:p>
     <w:p>
       <w:pPr>
-        <w:spacing w:after="80" w:before="0"/>
+        <w:spacing w:before="0" w:after="80" w:line="269" w:lineRule="auto"/>
+      </w:pPr>
+      <w:r>
+        <w:rPr>
+          <w:rFonts w:ascii="Arial" w:hAnsi="Arial"/>
+          <w:b/>
+          <w:sz w:val="24"/>
+        </w:rPr>
+        <w:t>📞 Запись в Королёвскую стоматологическую поликлинику: 8 (499) 490-55-55</w:t>
+      </w:r>
+    </w:p>
+    <w:p>
+      <w:pPr>
+        <w:spacing w:before="0" w:after="80" w:line="269" w:lineRule="auto"/>
+      </w:pPr>
+      <w:r>
+        <w:rPr>
+          <w:rFonts w:ascii="Arial" w:hAnsi="Arial"/>
+          <w:b/>
+          <w:sz w:val="24"/>
+        </w:rPr>
+        <w:t>🌐 https://clck.ru/3N8E8Q</w:t>
+      </w:r>
+    </w:p>
+    <w:p>
+      <w:pPr>
+        <w:spacing w:before="0" w:after="80" w:line="269" w:lineRule="auto"/>
+      </w:pPr>
+      <w:r>
+        <w:rPr>
+          <w:rFonts w:ascii="Arial" w:hAnsi="Arial"/>
+          <w:b w:val="0"/>
+          <w:sz w:val="24"/>
+        </w:rPr>
+        <w:t>#КоролёвскаяСтоматологическаяПоликлиника #КоролёвскаяСтоматология #стоматологияКоролёв</w:t>
+      </w:r>
+    </w:p>
+    <w:p>
+      <w:r>
+        <w:br w:type="page"/>
+      </w:r>
+    </w:p>
+    <w:p>
+      <w:pPr>
+        <w:spacing w:before="0" w:after="160" w:line="269" w:lineRule="auto"/>
+      </w:pPr>
+      <w:r>
+        <w:rPr>
+          <w:rFonts w:ascii="Arial" w:hAnsi="Arial"/>
+          <w:b/>
+          <w:color w:val="C00000"/>
+          <w:sz w:val="30"/>
+        </w:rPr>
+        <w:t>для Макс,Телеграм:</w:t>
+      </w:r>
+    </w:p>
+    <w:p>
+      <w:pPr>
+        <w:spacing w:before="0" w:after="240" w:line="269" w:lineRule="auto"/>
+      </w:pPr>
+      <w:r>
+        <w:rPr>
+          <w:rFonts w:ascii="Arial" w:hAnsi="Arial"/>
+          <w:b/>
+          <w:sz w:val="36"/>
+        </w:rPr>
+        <w:t>Как остановить кровоточивость дёсен</w:t>
+      </w:r>
+    </w:p>
+    <w:p>
+      <w:pPr>
+        <w:spacing w:before="0" w:after="120" w:line="269" w:lineRule="auto"/>
+      </w:pPr>
+      <w:r>
+        <w:rPr>
+          <w:rFonts w:ascii="Arial" w:hAnsi="Arial"/>
+          <w:b w:val="0"/>
+          <w:sz w:val="24"/>
+        </w:rPr>
+        <w:t>🦷✨ Кровоточивость дёсен — сигнал, а не мелочь. Чаще всего виноват налёт у десны и травматичная чистка.</w:t>
+      </w:r>
+    </w:p>
+    <w:p>
+      <w:pPr>
+        <w:spacing w:before="80" w:after="100" w:line="269" w:lineRule="auto"/>
+      </w:pPr>
+      <w:r>
+        <w:rPr>
+          <w:rFonts w:ascii="Arial" w:hAnsi="Arial"/>
+          <w:b/>
+          <w:color w:val="1F4E79"/>
+          <w:sz w:val="26"/>
+        </w:rPr>
+        <w:t>✅ Что сделать сейчас:</w:t>
+      </w:r>
+    </w:p>
+    <w:p>
+      <w:pPr>
+        <w:spacing w:before="0" w:after="60" w:line="269" w:lineRule="auto"/>
+      </w:pPr>
+      <w:r>
+        <w:rPr>
+          <w:rFonts w:ascii="Arial" w:hAnsi="Arial"/>
+          <w:b w:val="0"/>
+          <w:sz w:val="24"/>
+        </w:rPr>
+        <w:t>— чистить мягко, без давления</w:t>
+      </w:r>
+    </w:p>
+    <w:p>
+      <w:pPr>
+        <w:spacing w:before="0" w:after="60" w:line="269" w:lineRule="auto"/>
+      </w:pPr>
+      <w:r>
+        <w:rPr>
+          <w:rFonts w:ascii="Arial" w:hAnsi="Arial"/>
+          <w:b w:val="0"/>
+          <w:sz w:val="24"/>
+        </w:rPr>
+        <w:t>— взять мягкую/среднюю щётку</w:t>
+      </w:r>
+    </w:p>
+    <w:p>
+      <w:pPr>
+        <w:spacing w:before="0" w:after="60" w:line="269" w:lineRule="auto"/>
+      </w:pPr>
+      <w:r>
+        <w:rPr>
+          <w:rFonts w:ascii="Arial" w:hAnsi="Arial"/>
+          <w:b w:val="0"/>
+          <w:sz w:val="24"/>
+        </w:rPr>
+        <w:t>— аккуратно подключить нить, ёршики или ирригатор</w:t>
+      </w:r>
+    </w:p>
+    <w:p>
+      <w:pPr>
+        <w:spacing w:before="0" w:after="60" w:line="269" w:lineRule="auto"/>
+      </w:pPr>
+      <w:r>
+        <w:rPr>
+          <w:rFonts w:ascii="Arial" w:hAnsi="Arial"/>
+          <w:b w:val="0"/>
+          <w:sz w:val="24"/>
+        </w:rPr>
+        <w:t>— не заменять чистку одним полосканием</w:t>
+      </w:r>
+    </w:p>
+    <w:p>
+      <w:pPr>
+        <w:spacing w:before="0" w:after="60" w:line="269" w:lineRule="auto"/>
+      </w:pPr>
+      <w:r>
+        <w:rPr>
+          <w:rFonts w:ascii="Arial" w:hAnsi="Arial"/>
+          <w:b w:val="0"/>
+          <w:sz w:val="24"/>
+        </w:rPr>
+        <w:t>— меньше сладких липких перекусов, больше воды</w:t>
+      </w:r>
+    </w:p>
+    <w:p>
+      <w:pPr>
+        <w:spacing w:before="80" w:after="100" w:line="269" w:lineRule="auto"/>
+      </w:pPr>
+      <w:r>
+        <w:rPr>
+          <w:rFonts w:ascii="Arial" w:hAnsi="Arial"/>
+          <w:b/>
+          <w:color w:val="1F4E79"/>
+          <w:sz w:val="26"/>
+        </w:rPr>
+        <w:t>⚠️ К врачу, если кровь каждый день, дёсны отекли и болят, есть запах, оголение шеек или ситуация не лучше за 7–10 дней.</w:t>
+      </w:r>
+    </w:p>
+    <w:p>
+      <w:pPr>
+        <w:spacing w:before="80" w:after="100" w:line="269" w:lineRule="auto"/>
+      </w:pPr>
+      <w:r>
+        <w:rPr>
+          <w:rFonts w:ascii="Arial" w:hAnsi="Arial"/>
+          <w:b/>
+          <w:color w:val="1F4E79"/>
+          <w:sz w:val="26"/>
+        </w:rPr>
+        <w:t>🚫 Нельзя «жечь» дёсны спиртом и усиливать жёсткость щётки. Домашние меры помогают, но не заменяют осмотр.</w:t>
+      </w:r>
+    </w:p>
+    <w:p>
+      <w:pPr>
+        <w:spacing w:before="0" w:after="80" w:line="269" w:lineRule="auto"/>
       </w:pPr>
       <w:r>
         <w:rPr>
@@ -550,7 +796,7 @@
     </w:p>
     <w:p>
       <w:pPr>
-        <w:spacing w:after="80" w:before="0"/>
+        <w:spacing w:before="0" w:after="80" w:line="269" w:lineRule="auto"/>
       </w:pPr>
       <w:r>
         <w:rPr>
@@ -563,201 +809,7 @@
     </w:p>
     <w:p>
       <w:pPr>
-        <w:spacing w:after="80" w:before="0"/>
-      </w:pPr>
-      <w:r>
-        <w:rPr>
-          <w:rFonts w:ascii="Arial" w:hAnsi="Arial"/>
-          <w:b w:val="0"/>
-          <w:sz w:val="24"/>
-        </w:rPr>
-        <w:t>#КоролёвскаяСтоматологическаяПоликлиника #КоролёвскаяСтоматология #стоматологияКоролёв</w:t>
-      </w:r>
-    </w:p>
-    <w:p>
-      <w:pPr>
-        <w:spacing w:after="120" w:before="0"/>
-      </w:pPr>
-      <w:r>
-        <w:rPr>
-          <w:rFonts w:ascii="Arial" w:hAnsi="Arial"/>
-          <w:b w:val="0"/>
-          <w:sz w:val="24"/>
-        </w:rPr>
-      </w:r>
-    </w:p>
-    <w:p>
-      <w:pPr>
-        <w:spacing w:after="160" w:before="0"/>
-      </w:pPr>
-      <w:r>
-        <w:rPr>
-          <w:rFonts w:ascii="Arial" w:hAnsi="Arial"/>
-          <w:b w:val="0"/>
-          <w:sz w:val="24"/>
-        </w:rPr>
-        <w:t>——————</w:t>
-      </w:r>
-    </w:p>
-    <w:p>
-      <w:pPr>
-        <w:spacing w:after="200" w:before="0"/>
-      </w:pPr>
-      <w:r>
-        <w:rPr>
-          <w:rFonts w:ascii="Arial" w:hAnsi="Arial"/>
-          <w:b/>
-          <w:sz w:val="28"/>
-        </w:rPr>
-        <w:t>Версия для Telegram / MAX (ТГ)</w:t>
-      </w:r>
-    </w:p>
-    <w:p>
-      <w:pPr>
-        <w:spacing w:after="80" w:before="0"/>
-      </w:pPr>
-      <w:r>
-        <w:rPr>
-          <w:rFonts w:ascii="Arial" w:hAnsi="Arial"/>
-          <w:b w:val="0"/>
-          <w:sz w:val="24"/>
-        </w:rPr>
-        <w:t>🦷✨ Кровоточивость дёсен — сигнал, а не мелочь. Чаще всего виноват налёт у десны и травматичная чистка.</w:t>
-      </w:r>
-    </w:p>
-    <w:p>
-      <w:pPr>
-        <w:spacing w:after="80" w:before="0"/>
-      </w:pPr>
-      <w:r>
-        <w:rPr>
-          <w:rFonts w:ascii="Arial" w:hAnsi="Arial"/>
-          <w:b w:val="0"/>
-          <w:sz w:val="24"/>
-        </w:rPr>
-        <w:t>✅ Что сделать сейчас:</w:t>
-      </w:r>
-    </w:p>
-    <w:p>
-      <w:pPr>
-        <w:spacing w:after="80" w:before="0"/>
-      </w:pPr>
-      <w:r>
-        <w:rPr>
-          <w:rFonts w:ascii="Arial" w:hAnsi="Arial"/>
-          <w:b w:val="0"/>
-          <w:sz w:val="24"/>
-        </w:rPr>
-        <w:t>— чистить мягко, без давления</w:t>
-      </w:r>
-    </w:p>
-    <w:p>
-      <w:pPr>
-        <w:spacing w:after="80" w:before="0"/>
-      </w:pPr>
-      <w:r>
-        <w:rPr>
-          <w:rFonts w:ascii="Arial" w:hAnsi="Arial"/>
-          <w:b w:val="0"/>
-          <w:sz w:val="24"/>
-        </w:rPr>
-        <w:t>— взять мягкую/среднюю щётку</w:t>
-      </w:r>
-    </w:p>
-    <w:p>
-      <w:pPr>
-        <w:spacing w:after="80" w:before="0"/>
-      </w:pPr>
-      <w:r>
-        <w:rPr>
-          <w:rFonts w:ascii="Arial" w:hAnsi="Arial"/>
-          <w:b w:val="0"/>
-          <w:sz w:val="24"/>
-        </w:rPr>
-        <w:t>— аккуратно подключить нить, ёршики или ирригатор</w:t>
-      </w:r>
-    </w:p>
-    <w:p>
-      <w:pPr>
-        <w:spacing w:after="80" w:before="0"/>
-      </w:pPr>
-      <w:r>
-        <w:rPr>
-          <w:rFonts w:ascii="Arial" w:hAnsi="Arial"/>
-          <w:b w:val="0"/>
-          <w:sz w:val="24"/>
-        </w:rPr>
-        <w:t>— не заменять чистку одним полосканием</w:t>
-      </w:r>
-    </w:p>
-    <w:p>
-      <w:pPr>
-        <w:spacing w:after="80" w:before="0"/>
-      </w:pPr>
-      <w:r>
-        <w:rPr>
-          <w:rFonts w:ascii="Arial" w:hAnsi="Arial"/>
-          <w:b w:val="0"/>
-          <w:sz w:val="24"/>
-        </w:rPr>
-        <w:t>— меньше сладких липких перекусов, больше воды</w:t>
-      </w:r>
-    </w:p>
-    <w:p>
-      <w:pPr>
-        <w:spacing w:after="80" w:before="0"/>
-      </w:pPr>
-      <w:r>
-        <w:rPr>
-          <w:rFonts w:ascii="Arial" w:hAnsi="Arial"/>
-          <w:b w:val="0"/>
-          <w:sz w:val="24"/>
-        </w:rPr>
-        <w:t>⚠️ К врачу, если кровь каждый день, дёсны отекли и болят, есть запах, оголение шеек или ситуация не лучше за 7–10 дней.</w:t>
-      </w:r>
-    </w:p>
-    <w:p>
-      <w:pPr>
-        <w:spacing w:after="80" w:before="0"/>
-      </w:pPr>
-      <w:r>
-        <w:rPr>
-          <w:rFonts w:ascii="Arial" w:hAnsi="Arial"/>
-          <w:b w:val="0"/>
-          <w:sz w:val="24"/>
-        </w:rPr>
-        <w:t>🚫 Нельзя «жечь» дёсны спиртом и усиливать жёсткость щётки. Домашние меры помогают, но не заменяют осмотр.</w:t>
-      </w:r>
-    </w:p>
-    <w:p>
-      <w:pPr>
-        <w:spacing w:after="80" w:before="0"/>
-      </w:pPr>
-      <w:r>
-        <w:rPr>
-          <w:rFonts w:ascii="Arial" w:hAnsi="Arial"/>
-          <w:b w:val="0"/>
-          <w:sz w:val="24"/>
-        </w:rPr>
-        <w:t>📞 Запись в Королёвскую стоматологическую поликлинику: 8 (499) 490-55-55</w:t>
-      </w:r>
-    </w:p>
-    <w:p>
-      <w:pPr>
-        <w:spacing w:after="80" w:before="0"/>
-      </w:pPr>
-      <w:r>
-        <w:rPr>
-          <w:rFonts w:ascii="Arial" w:hAnsi="Arial"/>
-          <w:b w:val="0"/>
-          <w:sz w:val="24"/>
-        </w:rPr>
-        <w:t>🌐 https://clck.ru/3N8E8Q</w:t>
-      </w:r>
-    </w:p>
-    <w:p>
-      <w:pPr>
-        <w:spacing w:after="80" w:before="0"/>
+        <w:spacing w:before="0" w:after="80" w:line="269" w:lineRule="auto"/>
       </w:pPr>
       <w:r>
         <w:rPr>

</xml_diff>